<commit_message>
Update contact details and add logo to onboarding generator
- Replace placeholder phone/email with real contact details
- Add company logo to top of generated documents
- Keep navy branded styling beneath logo for subtitle and employee info

Co-Authored-By: Claude Sonnet 4.6 <noreply@anthropic.com>
</commit_message>
<xml_diff>
--- a/docs/reports/JamieWahler_Onboarding_2026-03-18.docx
+++ b/docs/reports/JamieWahler_Onboarding_2026-03-18.docx
@@ -19,21 +19,7 @@
           </w:tcPr>
           <w:p>
             <w:pPr>
-              <w:spacing w:before="320" w:after="40"/>
-              <w:jc w:val="center"/>
-            </w:pPr>
-            <w:r>
-              <w:rPr>
-                <w:b/>
-                <w:color w:val="FFFFFF"/>
-                <w:sz w:val="32"/>
-              </w:rPr>
-              <w:t>WAYMARK HR GROUP LLC</w:t>
-            </w:r>
-          </w:p>
-          <w:p>
-            <w:pPr>
-              <w:spacing w:before="0" w:after="40"/>
+              <w:spacing w:before="200" w:after="40"/>
               <w:jc w:val="center"/>
             </w:pPr>
             <w:r>
@@ -224,7 +210,7 @@
           <w:color w:val="007A87"/>
           <w:sz w:val="20"/>
         </w:rPr>
-        <w:t>(312) 555-0100</w:t>
+        <w:t>716-225-6347</w:t>
       </w:r>
     </w:p>
     <w:p>
@@ -239,7 +225,7 @@
           <w:color w:val="007A87"/>
           <w:sz w:val="20"/>
         </w:rPr>
-        <w:t>hr@waymarkhrgroup.com</w:t>
+        <w:t>Jamie.Wahler@waymarkhrgroup.com</w:t>
       </w:r>
     </w:p>
     <w:p>
@@ -2275,7 +2261,7 @@
                 <w:color w:val="2C2C2C"/>
                 <w:sz w:val="19"/>
               </w:rPr>
-              <w:t>(312) 555-0100 Ext. 100</w:t>
+              <w:t>716-225-6347 Ext. 100</w:t>
             </w:r>
           </w:p>
         </w:tc>
@@ -2293,7 +2279,7 @@
                 <w:color w:val="2C2C2C"/>
                 <w:sz w:val="19"/>
               </w:rPr>
-              <w:t>hr@waymarkhrgroup.com</w:t>
+              <w:t>Jamie.Wahler@waymarkhrgroup.com</w:t>
             </w:r>
           </w:p>
         </w:tc>
@@ -3258,7 +3244,7 @@
           <w:color w:val="888888"/>
           <w:sz w:val="17"/>
         </w:rPr>
-        <w:t>(312) 555-0100  |  hr@waymarkhrgroup.com  |  www.waymarkhrgroup.com</w:t>
+        <w:t>716-225-6347  |  Jamie.Wahler@waymarkhrgroup.com  |  www.waymarkhrgroup.com</w:t>
       </w:r>
     </w:p>
     <w:p>

</xml_diff>

<commit_message>
Add company logo and regenerate onboarding document with logo
Co-Authored-By: Claude Sonnet 4.6 <noreply@anthropic.com>
</commit_message>
<xml_diff>
--- a/docs/reports/JamieWahler_Onboarding_2026-03-18.docx
+++ b/docs/reports/JamieWahler_Onboarding_2026-03-18.docx
@@ -2,6 +2,46 @@
 <file path=word/document.xml><?xml version="1.0" encoding="utf-8"?>
 <w:document xmlns:wpc="http://schemas.microsoft.com/office/word/2010/wordprocessingCanvas" xmlns:mo="http://schemas.microsoft.com/office/mac/office/2008/main" xmlns:mc="http://schemas.openxmlformats.org/markup-compatibility/2006" xmlns:mv="urn:schemas-microsoft-com:mac:vml" xmlns:o="urn:schemas-microsoft-com:office:office" xmlns:r="http://schemas.openxmlformats.org/officeDocument/2006/relationships" xmlns:m="http://schemas.openxmlformats.org/officeDocument/2006/math" xmlns:v="urn:schemas-microsoft-com:vml" xmlns:wp14="http://schemas.microsoft.com/office/word/2010/wordprocessingDrawing" xmlns:wp="http://schemas.openxmlformats.org/drawingml/2006/wordprocessingDrawing" xmlns:w10="urn:schemas-microsoft-com:office:word" xmlns:w="http://schemas.openxmlformats.org/wordprocessingml/2006/main" xmlns:w14="http://schemas.microsoft.com/office/word/2010/wordml" xmlns:wpg="http://schemas.microsoft.com/office/word/2010/wordprocessingGroup" xmlns:wpi="http://schemas.microsoft.com/office/word/2010/wordprocessingInk" xmlns:wne="http://schemas.microsoft.com/office/word/2006/wordml" xmlns:wps="http://schemas.microsoft.com/office/word/2010/wordprocessingShape" mc:Ignorable="w14 wp14">
   <w:body>
+    <w:p>
+      <w:pPr>
+        <w:spacing w:before="0" w:after="160"/>
+        <w:jc w:val="center"/>
+      </w:pPr>
+      <w:r>
+        <w:drawing>
+          <wp:inline xmlns:a="http://schemas.openxmlformats.org/drawingml/2006/main" xmlns:pic="http://schemas.openxmlformats.org/drawingml/2006/picture">
+            <wp:extent cx="2743200" cy="2743200"/>
+            <wp:docPr id="1" name="Picture 1"/>
+            <wp:cNvGraphicFramePr>
+              <a:graphicFrameLocks noChangeAspect="1"/>
+            </wp:cNvGraphicFramePr>
+            <a:graphic>
+              <a:graphicData uri="http://schemas.openxmlformats.org/drawingml/2006/picture">
+                <pic:pic>
+                  <pic:nvPicPr>
+                    <pic:cNvPr id="0" name="Waymark_HR_Group_Logo_Full.png"/>
+                    <pic:cNvPicPr/>
+                  </pic:nvPicPr>
+                  <pic:blipFill>
+                    <a:blip r:embed="rId9"/>
+                    <a:stretch>
+                      <a:fillRect/>
+                    </a:stretch>
+                  </pic:blipFill>
+                  <pic:spPr>
+                    <a:xfrm>
+                      <a:off x="0" y="0"/>
+                      <a:ext cx="2743200" cy="2743200"/>
+                    </a:xfrm>
+                    <a:prstGeom prst="rect"/>
+                  </pic:spPr>
+                </pic:pic>
+              </a:graphicData>
+            </a:graphic>
+          </wp:inline>
+        </w:drawing>
+      </w:r>
+    </w:p>
     <w:tbl>
       <w:tblPr>
         <w:tblW w:type="auto" w:w="0"/>

</xml_diff>